<commit_message>
Add auto bullet-list rendering for IEnumerable<string> properties (#3)
* Add auto bullet-list rendering for IEnumerable<string> properties

  Mirrors Excelsior's "Enumerable string properties" feature: a solo
  {{ Tags }} substitution where Tags is IEnumerable<string> on the root
  model auto-renders as a Word native bullet list, with no attribute
  needed. Reuses TokenValueHelpers.BulletList (the existing bullet_list
  filter primitive). Dispatches after Excelsior and Format, before Fluid.

  Opportunistic — not strict — so the existing bullet_list / numbered_list
  filter usage on IEnumerable<string> properties keeps working unchanged.
  The auto path skips silently when the token isn't solo in its paragraph
  or has a filter chain, falling through to Fluid in those cases.

* .
</commit_message>
<xml_diff>
--- a/src/Parchment.Tests/Docx/ExcelsiorTableTests.NestedPathRendersAsExcelsiorTable.verified.docx
+++ b/src/Parchment.Tests/Docx/ExcelsiorTableTests.NestedPathRendersAsExcelsiorTable.verified.docx
@@ -101,8 +101,14 @@
       </w:r>
     </w:p>
     <w:sectPr>
-      <w:pgSz w:w="12240" w:h="15840"/>
+      <w:pgSz w:w="6500" w:h="8000"/>
       <w:pgMar w:top="500" w:right="500" w:bottom="500" w:left="500" w:header="720" w:footer="720"/>
+      <w:pgBorders w:zOrder="front" w:display="allPages" w:offsetFrom="page">
+        <w:top w:val="single" w:color="000000" w:sz="4" w:space="0"/>
+        <w:left w:val="single" w:color="000000" w:sz="4" w:space="0"/>
+        <w:bottom w:val="single" w:color="000000" w:sz="4" w:space="0"/>
+        <w:right w:val="single" w:color="000000" w:sz="4" w:space="0"/>
+      </w:pgBorders>
     </w:sectPr>
   </w:body>
 </w:document>

</xml_diff>

<commit_message>
Bump Excelsior; update snapshots; fix anchor check
Upgrade Excelsior package to 3.4.2. Update verified DOCX/PNG snapshots for excelsior-table tests to reflect rendering changes. Simplify null check in Anchors.cs by replacing the pattern-match capture with an explicit ids != null && ids.Contains(endId) check when collecting BookmarkEnd entries.
</commit_message>
<xml_diff>
--- a/src/Parchment.Tests/Docx/ExcelsiorTableTests.NestedPathRendersAsExcelsiorTable.verified.docx
+++ b/src/Parchment.Tests/Docx/ExcelsiorTableTests.NestedPathRendersAsExcelsiorTable.verified.docx
@@ -26,7 +26,7 @@
         <w:tc>
           <w:p>
             <w:pPr>
-              <w:jc w:val="center"/>
+              <w:jc w:val="left"/>
             </w:pPr>
             <w:r>
               <w:rPr>
@@ -39,7 +39,7 @@
         <w:tc>
           <w:p>
             <w:pPr>
-              <w:jc w:val="center"/>
+              <w:jc w:val="left"/>
             </w:pPr>
             <w:r>
               <w:rPr>

</xml_diff>